<commit_message>
Credit team Shakuni Ke Sher
Replaces the team-name placeholder in the ideation report masthead and adds
the credit to the README. Report DOCX and PDF rebuilt from the corrected
source; still 3 pages.

Co-Authored-By: Claude Opus 5 <noreply@anthropic.com>
</commit_message>
<xml_diff>
--- a/docs/GridPulse-Ideation-Report.docx
+++ b/docs/GridPulse-Ideation-Report.docx
@@ -80,11 +80,11 @@
       <w:r>
         <w:rPr>
           <w:rFonts w:ascii="Calibri" w:cs="Calibri" w:eastAsia="Calibri" w:hAnsi="Calibri"/>
-          <w:color w:val="A35F00"/>
+          <w:color w:val="4C5F6B"/>
           <w:sz w:val="16"/>
           <w:szCs w:val="16"/>
         </w:rPr>
-        <w:t xml:space="preserve">[ add team name ]   </w:t>
+        <w:t xml:space="preserve">Shakuni Ke Sher   </w:t>
       </w:r>
       <w:r>
         <w:rPr>

</xml_diff>